<commit_message>
fix(docs): keep decision boxes from pushing content to the next page
</commit_message>
<xml_diff>
--- a/docs/export/reference-jri.docx
+++ b/docs/export/reference-jri.docx
@@ -1274,6 +1274,23 @@
     <w:qFormat/>
     <w:pPr>
       <w:keepNext/>
+      <w:keepLines/>
+      <w:pBdr>
+        <w:top w:val="single" w:sz="24" w:space="10" w:color="000000"/>
+        <w:left w:val="single" w:sz="24" w:space="12" w:color="000000"/>
+        <w:bottom w:val="single" w:sz="24" w:space="10" w:color="000000"/>
+        <w:right w:val="single" w:sz="24" w:space="12" w:color="000000"/>
+      </w:pBdr>
+      <w:spacing w:before="60" w:after="60" w:line="300" w:lineRule="auto"/>
+      <w:ind w:left="240" w:right="240"/>
+    </w:pPr>
+    <w:rPr/>
+  </w:style>
+  <w:style w:type="paragraph" w:customStyle="1" w:styleId="Cartouchefin">
+    <w:name w:val="Cartouche fin"/>
+    <w:basedOn w:val="Normal"/>
+    <w:qFormat/>
+    <w:pPr>
       <w:keepLines/>
       <w:pBdr>
         <w:top w:val="single" w:sz="24" w:space="10" w:color="000000"/>

</xml_diff>